<commit_message>
Subir todos los archivos de aguadilla
</commit_message>
<xml_diff>
--- a/supabase key.docx
+++ b/supabase key.docx
@@ -50,6 +50,12 @@
       <w:proofErr w:type="gramEnd"/>
       <w:r>
         <w:t>cI5f0TDuI0uDxxEywnWWBC9TpPXXnhq9bUW1RKXyFY</w:t>
+      </w:r>
+    </w:p>
+    <w:p/>
+    <w:p>
+      <w:r>
+        <w:t>solivan.ja@gmail.com/Khlomatt0715!!</w:t>
       </w:r>
     </w:p>
     <w:sectPr>
@@ -665,6 +671,7 @@
   <w:style w:type="character" w:default="1" w:styleId="DefaultParagraphFont">
     <w:name w:val="Default Paragraph Font"/>
     <w:uiPriority w:val="1"/>
+    <w:semiHidden/>
     <w:unhideWhenUsed/>
   </w:style>
   <w:style w:type="table" w:default="1" w:styleId="TableNormal">

</xml_diff>